<commit_message>
Updates the labour certification to be compatible with other certificates for Milana
</commit_message>
<xml_diff>
--- a/templates/labour_protection.docx
+++ b/templates/labour_protection.docx
@@ -117,6 +117,52 @@
               </w:rPr>
               <w:t xml:space="preserve"> }}</w:t>
             </w:r>
+            <w:r>
+              <w:rPr>
+                <w:b/>
+                <w:bCs/>
+                <w:sz w:val="18"/>
+                <w:szCs w:val="18"/>
+              </w:rPr>
+              <w:t xml:space="preserve"> </w:t>
+            </w:r>
+            <w:r>
+              <w:rPr>
+                <w:b/>
+                <w:bCs/>
+                <w:sz w:val="18"/>
+                <w:szCs w:val="18"/>
+              </w:rPr>
+              <w:t>–</w:t>
+            </w:r>
+            <w:r>
+              <w:rPr>
+                <w:b/>
+                <w:bCs/>
+                <w:sz w:val="18"/>
+                <w:szCs w:val="18"/>
+              </w:rPr>
+              <w:t xml:space="preserve"> {{ </w:t>
+            </w:r>
+            <w:r>
+              <w:rPr>
+                <w:b/>
+                <w:bCs/>
+                <w:sz w:val="18"/>
+                <w:szCs w:val="18"/>
+                <w:lang w:val="en-US"/>
+              </w:rPr>
+              <w:t>year</w:t>
+            </w:r>
+            <w:r>
+              <w:rPr>
+                <w:b/>
+                <w:bCs/>
+                <w:sz w:val="18"/>
+                <w:szCs w:val="18"/>
+              </w:rPr>
+              <w:t xml:space="preserve"> }}</w:t>
+            </w:r>
           </w:p>
           <w:p>
             <w:pPr>
@@ -135,7 +181,16 @@
                 <w:sz w:val="18"/>
                 <w:szCs w:val="18"/>
               </w:rPr>
-              <w:t xml:space="preserve">О ПРОВЕРКЕ ЗНАНИЙ ТРЕБОВАНИЙ </w:t>
+              <w:t>О ПРОВЕРКЕ ЗНАНИЙ ТРЕБОВАНИЙ</w:t>
+            </w:r>
+            <w:r>
+              <w:rPr>
+                <w:b/>
+                <w:bCs/>
+                <w:sz w:val="18"/>
+                <w:szCs w:val="18"/>
+              </w:rPr>
+              <w:t xml:space="preserve"> ПО ПРОГРАММЕ</w:t>
             </w:r>
           </w:p>
           <w:p>
@@ -160,7 +215,6 @@
               </w:rPr>
               <w:t xml:space="preserve">{{ </w:t>
             </w:r>
-            <w:proofErr w:type="spellStart"/>
             <w:r>
               <w:rPr>
                 <w:b/>
@@ -180,9 +234,18 @@
                 <w:szCs w:val="18"/>
                 <w:lang w:val="en-US"/>
               </w:rPr>
-              <w:t>_profession</w:t>
-            </w:r>
-            <w:proofErr w:type="spellEnd"/>
+              <w:t>_</w:t>
+            </w:r>
+            <w:r>
+              <w:rPr>
+                <w:b/>
+                <w:bCs/>
+                <w:sz w:val="18"/>
+                <w:szCs w:val="18"/>
+                <w:lang w:val="en-US"/>
+              </w:rPr>
+              <w:t>profession</w:t>
+            </w:r>
             <w:r>
               <w:rPr>
                 <w:b/>
@@ -231,18 +294,7 @@
                 <w:szCs w:val="18"/>
                 <w:lang w:val="en-US"/>
               </w:rPr>
-              <w:t xml:space="preserve"> </w:t>
-            </w:r>
-            <w:proofErr w:type="gramStart"/>
-            <w:r>
-              <w:rPr>
-                <w:b/>
-                <w:bCs/>
-                <w:sz w:val="18"/>
-                <w:szCs w:val="18"/>
-                <w:lang w:val="en-US"/>
-              </w:rPr>
-              <w:t xml:space="preserve">{{ </w:t>
+              <w:t xml:space="preserve"> {{ </w:t>
             </w:r>
             <w:proofErr w:type="spellStart"/>
             <w:r>
@@ -255,7 +307,6 @@
               </w:rPr>
               <w:t>student</w:t>
             </w:r>
-            <w:proofErr w:type="gramEnd"/>
             <w:r>
               <w:rPr>
                 <w:b/>
@@ -404,7 +455,7 @@
                 <w:bCs/>
                 <w:sz w:val="18"/>
                 <w:szCs w:val="18"/>
-                <w:lang w:eastAsia="ru-RU"/>
+                <w:lang w:val="en-US" w:eastAsia="ru-RU"/>
               </w:rPr>
             </w:pPr>
             <w:r>
@@ -414,14 +465,25 @@
                 <w:szCs w:val="18"/>
                 <w:u w:val="single"/>
               </w:rPr>
-              <w:t>Должность:</w:t>
-            </w:r>
-            <w:r>
-              <w:rPr>
-                <w:b/>
-                <w:bCs/>
-                <w:sz w:val="18"/>
-                <w:szCs w:val="18"/>
+              <w:t>Должность</w:t>
+            </w:r>
+            <w:r>
+              <w:rPr>
+                <w:bCs/>
+                <w:sz w:val="18"/>
+                <w:szCs w:val="18"/>
+                <w:u w:val="single"/>
+                <w:lang w:val="en-US"/>
+              </w:rPr>
+              <w:t>:</w:t>
+            </w:r>
+            <w:r>
+              <w:rPr>
+                <w:b/>
+                <w:bCs/>
+                <w:sz w:val="18"/>
+                <w:szCs w:val="18"/>
+                <w:lang w:val="en-US"/>
               </w:rPr>
               <w:t xml:space="preserve"> </w:t>
             </w:r>
@@ -431,10 +493,11 @@
                 <w:bCs/>
                 <w:sz w:val="18"/>
                 <w:szCs w:val="18"/>
-                <w:lang w:eastAsia="ru-RU"/>
+                <w:lang w:val="en-US" w:eastAsia="ru-RU"/>
               </w:rPr>
               <w:t xml:space="preserve">{{ </w:t>
             </w:r>
+            <w:proofErr w:type="spellStart"/>
             <w:r>
               <w:rPr>
                 <w:b/>
@@ -451,7 +514,7 @@
                 <w:bCs/>
                 <w:sz w:val="18"/>
                 <w:szCs w:val="18"/>
-                <w:lang w:eastAsia="ru-RU"/>
+                <w:lang w:val="en-US" w:eastAsia="ru-RU"/>
               </w:rPr>
               <w:t>_</w:t>
             </w:r>
@@ -465,13 +528,14 @@
               </w:rPr>
               <w:t>role</w:t>
             </w:r>
-            <w:r>
-              <w:rPr>
-                <w:b/>
-                <w:bCs/>
-                <w:sz w:val="18"/>
-                <w:szCs w:val="18"/>
-                <w:lang w:eastAsia="ru-RU"/>
+            <w:proofErr w:type="spellEnd"/>
+            <w:r>
+              <w:rPr>
+                <w:b/>
+                <w:bCs/>
+                <w:sz w:val="18"/>
+                <w:szCs w:val="18"/>
+                <w:lang w:val="en-US" w:eastAsia="ru-RU"/>
               </w:rPr>
               <w:t xml:space="preserve"> }}</w:t>
             </w:r>
@@ -493,7 +557,7 @@
                 <w:sz w:val="18"/>
                 <w:szCs w:val="18"/>
               </w:rPr>
-              <w:t xml:space="preserve">Проведена проверка знаний требований охраны труда </w:t>
+              <w:t xml:space="preserve">Проведена проверка знаний требований </w:t>
             </w:r>
             <w:r>
               <w:rPr>
@@ -1034,8 +1098,8 @@
             <w:r>
               <w:rPr>
                 <w:b/>
-                <w:sz w:val="32"/>
-                <w:szCs w:val="32"/>
+                <w:sz w:val="28"/>
+                <w:szCs w:val="28"/>
               </w:rPr>
               <w:t>УДОСТОВЕРЕНИЕ</w:t>
             </w:r>
@@ -1046,15 +1110,11 @@
               <w:jc w:val="center"/>
               <w:rPr>
                 <w:b/>
-                <w:sz w:val="28"/>
-                <w:szCs w:val="28"/>
               </w:rPr>
             </w:pPr>
             <w:r>
               <w:rPr>
                 <w:b/>
-                <w:sz w:val="28"/>
-                <w:szCs w:val="28"/>
               </w:rPr>
               <w:t xml:space="preserve">о проверке знаний </w:t>
             </w:r>
@@ -1065,24 +1125,29 @@
               <w:jc w:val="center"/>
               <w:rPr>
                 <w:b/>
-                <w:sz w:val="28"/>
-                <w:szCs w:val="28"/>
               </w:rPr>
             </w:pPr>
             <w:r>
               <w:rPr>
                 <w:b/>
-                <w:sz w:val="28"/>
-                <w:szCs w:val="28"/>
-              </w:rPr>
-              <w:t xml:space="preserve">требований </w:t>
-            </w:r>
-            <w:proofErr w:type="gramStart"/>
-            <w:r>
-              <w:rPr>
-                <w:b/>
-                <w:sz w:val="28"/>
-                <w:szCs w:val="28"/>
+              </w:rPr>
+              <w:t>требований</w:t>
+            </w:r>
+            <w:r>
+              <w:rPr>
+                <w:b/>
+              </w:rPr>
+              <w:t xml:space="preserve"> по программе</w:t>
+            </w:r>
+            <w:r>
+              <w:rPr>
+                <w:b/>
+              </w:rPr>
+              <w:t xml:space="preserve"> </w:t>
+            </w:r>
+            <w:r>
+              <w:rPr>
+                <w:b/>
               </w:rPr>
               <w:t xml:space="preserve">{{ </w:t>
             </w:r>
@@ -1090,28 +1155,14 @@
             <w:r>
               <w:rPr>
                 <w:b/>
-                <w:sz w:val="28"/>
-                <w:szCs w:val="28"/>
-                <w:lang w:val="en-US"/>
-              </w:rPr>
-              <w:t>student</w:t>
-            </w:r>
-            <w:proofErr w:type="gramEnd"/>
-            <w:r>
-              <w:rPr>
-                <w:b/>
-                <w:sz w:val="28"/>
-                <w:szCs w:val="28"/>
-                <w:lang w:val="en-US"/>
-              </w:rPr>
-              <w:t>_profession</w:t>
+                <w:lang w:val="en-US"/>
+              </w:rPr>
+              <w:t>student_profession</w:t>
             </w:r>
             <w:proofErr w:type="spellEnd"/>
             <w:r>
               <w:rPr>
                 <w:b/>
-                <w:sz w:val="28"/>
-                <w:szCs w:val="28"/>
               </w:rPr>
               <w:t>}}</w:t>
             </w:r>

</xml_diff>

<commit_message>
Adds corrections to the format of ot cert
</commit_message>
<xml_diff>
--- a/templates/labour_protection.docx
+++ b/templates/labour_protection.docx
@@ -54,7 +54,6 @@
               <w:rPr>
                 <w:b/>
                 <w:bCs/>
-                <w:color w:val="000000"/>
                 <w:sz w:val="18"/>
                 <w:szCs w:val="18"/>
               </w:rPr>
@@ -170,32 +169,14 @@
               <w:rPr>
                 <w:b/>
                 <w:bCs/>
+                <w:color w:val="000000"/>
                 <w:sz w:val="18"/>
                 <w:szCs w:val="18"/>
               </w:rPr>
             </w:pPr>
-            <w:r>
-              <w:rPr>
-                <w:b/>
-                <w:bCs/>
-                <w:sz w:val="18"/>
-                <w:szCs w:val="18"/>
-              </w:rPr>
-              <w:t>О ПРОВЕРКЕ ЗНАНИЙ ТРЕБОВАНИЙ</w:t>
-            </w:r>
-            <w:r>
-              <w:rPr>
-                <w:b/>
-                <w:bCs/>
-                <w:sz w:val="18"/>
-                <w:szCs w:val="18"/>
-              </w:rPr>
-              <w:t xml:space="preserve"> ПО ПРОГРАММЕ</w:t>
-            </w:r>
           </w:p>
           <w:p>
             <w:pPr>
-              <w:jc w:val="center"/>
               <w:rPr>
                 <w:b/>
                 <w:bCs/>
@@ -204,6 +185,35 @@
                 <w:lang w:val="en-US"/>
               </w:rPr>
             </w:pPr>
+            <w:r>
+              <w:rPr>
+                <w:bCs/>
+                <w:sz w:val="18"/>
+                <w:szCs w:val="18"/>
+                <w:u w:val="single"/>
+              </w:rPr>
+              <w:t>Выдано</w:t>
+            </w:r>
+            <w:r>
+              <w:rPr>
+                <w:bCs/>
+                <w:sz w:val="18"/>
+                <w:szCs w:val="18"/>
+                <w:u w:val="single"/>
+                <w:lang w:val="en-US"/>
+              </w:rPr>
+              <w:t>:</w:t>
+            </w:r>
+            <w:r>
+              <w:rPr>
+                <w:b/>
+                <w:bCs/>
+                <w:sz w:val="18"/>
+                <w:szCs w:val="18"/>
+                <w:lang w:val="en-US"/>
+              </w:rPr>
+              <w:t xml:space="preserve"> </w:t>
+            </w:r>
             <w:proofErr w:type="gramStart"/>
             <w:r>
               <w:rPr>
@@ -215,6 +225,7 @@
               </w:rPr>
               <w:t xml:space="preserve">{{ </w:t>
             </w:r>
+            <w:proofErr w:type="spellStart"/>
             <w:r>
               <w:rPr>
                 <w:b/>
@@ -226,87 +237,6 @@
               <w:t>student</w:t>
             </w:r>
             <w:proofErr w:type="gramEnd"/>
-            <w:r>
-              <w:rPr>
-                <w:b/>
-                <w:bCs/>
-                <w:sz w:val="18"/>
-                <w:szCs w:val="18"/>
-                <w:lang w:val="en-US"/>
-              </w:rPr>
-              <w:t>_</w:t>
-            </w:r>
-            <w:r>
-              <w:rPr>
-                <w:b/>
-                <w:bCs/>
-                <w:sz w:val="18"/>
-                <w:szCs w:val="18"/>
-                <w:lang w:val="en-US"/>
-              </w:rPr>
-              <w:t>profession</w:t>
-            </w:r>
-            <w:r>
-              <w:rPr>
-                <w:b/>
-                <w:bCs/>
-                <w:sz w:val="18"/>
-                <w:szCs w:val="18"/>
-                <w:lang w:val="en-US"/>
-              </w:rPr>
-              <w:t xml:space="preserve"> }}</w:t>
-            </w:r>
-          </w:p>
-          <w:p>
-            <w:pPr>
-              <w:rPr>
-                <w:b/>
-                <w:bCs/>
-                <w:sz w:val="18"/>
-                <w:szCs w:val="18"/>
-                <w:lang w:val="en-US"/>
-              </w:rPr>
-            </w:pPr>
-            <w:r>
-              <w:rPr>
-                <w:bCs/>
-                <w:sz w:val="18"/>
-                <w:szCs w:val="18"/>
-                <w:u w:val="single"/>
-              </w:rPr>
-              <w:t>Выдано</w:t>
-            </w:r>
-            <w:r>
-              <w:rPr>
-                <w:bCs/>
-                <w:sz w:val="18"/>
-                <w:szCs w:val="18"/>
-                <w:u w:val="single"/>
-                <w:lang w:val="en-US"/>
-              </w:rPr>
-              <w:t>:</w:t>
-            </w:r>
-            <w:r>
-              <w:rPr>
-                <w:b/>
-                <w:bCs/>
-                <w:sz w:val="18"/>
-                <w:szCs w:val="18"/>
-                <w:lang w:val="en-US"/>
-              </w:rPr>
-              <w:t xml:space="preserve"> {{ </w:t>
-            </w:r>
-            <w:proofErr w:type="spellStart"/>
-            <w:r>
-              <w:rPr>
-                <w:b/>
-                <w:bCs/>
-                <w:sz w:val="18"/>
-                <w:szCs w:val="18"/>
-                <w:lang w:val="en-US"/>
-              </w:rPr>
-              <w:t>student</w:t>
-            </w:r>
             <w:r>
               <w:rPr>
                 <w:b/>
@@ -1135,6 +1065,7 @@
           <w:tcPr>
             <w:tcW w:w="5875" w:type="dxa"/>
             <w:shd w:val="clear" w:color="auto" w:fill="auto"/>
+            <w:vAlign w:val="center"/>
           </w:tcPr>
           <w:p>
             <w:pPr>
@@ -1155,40 +1086,6 @@
               <w:t>prof_educ_logo</w:t>
             </w:r>
             <w:proofErr w:type="spellEnd"/>
-          </w:p>
-          <w:p>
-            <w:pPr>
-              <w:spacing w:line="276" w:lineRule="auto"/>
-              <w:jc w:val="center"/>
-              <w:rPr>
-                <w:b/>
-                <w:sz w:val="28"/>
-                <w:szCs w:val="28"/>
-              </w:rPr>
-            </w:pPr>
-            <w:r>
-              <w:rPr>
-                <w:b/>
-                <w:sz w:val="28"/>
-                <w:szCs w:val="28"/>
-              </w:rPr>
-              <w:t>УДОСТОВЕРЕНИЕ</w:t>
-            </w:r>
-          </w:p>
-          <w:p>
-            <w:pPr>
-              <w:spacing w:line="276" w:lineRule="auto"/>
-              <w:jc w:val="center"/>
-              <w:rPr>
-                <w:b/>
-              </w:rPr>
-            </w:pPr>
-            <w:r>
-              <w:rPr>
-                <w:b/>
-              </w:rPr>
-              <w:t xml:space="preserve">о проверке знаний </w:t>
-            </w:r>
           </w:p>
           <w:p>
             <w:pPr>
@@ -1196,59 +1093,17 @@
               <w:jc w:val="center"/>
               <w:rPr>
                 <w:b/>
+                <w:sz w:val="22"/>
+                <w:szCs w:val="22"/>
               </w:rPr>
             </w:pPr>
             <w:r>
               <w:rPr>
                 <w:b/>
-              </w:rPr>
-              <w:t>требований</w:t>
-            </w:r>
-            <w:r>
-              <w:rPr>
-                <w:b/>
-              </w:rPr>
-              <w:t xml:space="preserve"> по программе</w:t>
-            </w:r>
-            <w:r>
-              <w:rPr>
-                <w:b/>
-              </w:rPr>
-              <w:t xml:space="preserve"> </w:t>
-            </w:r>
-            <w:proofErr w:type="gramStart"/>
-            <w:r>
-              <w:rPr>
-                <w:b/>
-              </w:rPr>
-              <w:t xml:space="preserve">{{ </w:t>
-            </w:r>
-            <w:r>
-              <w:rPr>
-                <w:b/>
-                <w:lang w:val="en-US"/>
-              </w:rPr>
-              <w:t>student</w:t>
-            </w:r>
-            <w:proofErr w:type="gramEnd"/>
-            <w:r>
-              <w:rPr>
-                <w:b/>
-              </w:rPr>
-              <w:t>_</w:t>
-            </w:r>
-            <w:r>
-              <w:rPr>
-                <w:b/>
-                <w:lang w:val="en-US"/>
-              </w:rPr>
-              <w:t>profession</w:t>
-            </w:r>
-            <w:r>
-              <w:rPr>
-                <w:b/>
-              </w:rPr>
-              <w:t>}}</w:t>
+                <w:sz w:val="22"/>
+                <w:szCs w:val="22"/>
+              </w:rPr>
+              <w:t>Общество с ограниченной ответственностью</w:t>
             </w:r>
           </w:p>
           <w:p>
@@ -1261,6 +1116,14 @@
                 <w:szCs w:val="22"/>
               </w:rPr>
             </w:pPr>
+            <w:r>
+              <w:rPr>
+                <w:b/>
+                <w:sz w:val="22"/>
+                <w:szCs w:val="22"/>
+              </w:rPr>
+              <w:t>«Профессиональное обучение»</w:t>
+            </w:r>
           </w:p>
           <w:tbl>
             <w:tblPr>

</xml_diff>